<commit_message>
Ajout0 MUTEX pour désactivation alarme via clavier
Introduce a mutex (lcdMutex) to protect concurrent access to the M5.Lcd and wrap LCD drawing in xSemaphoreTake/xSemaphoreGive. Refactor and consolidate UI logic: add screen management and drawing functions (drawHome, drawOptions, setScreen, initHomeButtons, initOptionsButtons, clearButtons, animateBtn) and centralize button handling. Move and deduplicate handleRFIDInput; refine handleMDPInput to only unlock when verification is true and to call setScreen(HOME). Change default KEYBOARD_PWD from "1234567" to "1111". Adjust FreeRTOS task creation parameters (taskTraiteTrame pinned to core 0, taskGestionLcd priority/core modified). Ensure taskGestionLcd also uses the LCD mutex when updating displayBuffer and rendering lines. Minor code cleanup and ordering changes.
</commit_message>
<xml_diff>
--- a/IHM_Hub/Rapport communication.docx
+++ b/IHM_Hub/Rapport communication.docx
@@ -8,6 +8,14 @@
       </w:pPr>
       <w:r>
         <w:t>Communication entre le HUB et le clavier</w:t>
+      </w:r>
+    </w:p>
+    <w:p>
+      <w:pPr>
+        <w:pStyle w:val="Sous-titre"/>
+      </w:pPr>
+      <w:r>
+        <w:t>Objectif</w:t>
       </w:r>
     </w:p>
     <w:p>
@@ -260,8 +268,17 @@
     </w:p>
     <w:p>
       <w:pPr>
-        <w:ind w:firstLine="0"/>
-      </w:pPr>
+        <w:pStyle w:val="Sous-titre"/>
+      </w:pPr>
+      <w:r>
+        <w:t>Tests</w:t>
+      </w:r>
+    </w:p>
+    <w:p/>
+    <w:p>
+      <w:r>
+        <w:t>Lors de l’envoi d’une trame par le clavier, le hub traite correctement la trame et renvoi une trame en réponse.</w:t>
+      </w:r>
     </w:p>
     <w:sectPr>
       <w:pgSz w:w="11906" w:h="16838"/>
@@ -1028,9 +1045,11 @@
     <w:next w:val="Corpsdetexte"/>
     <w:uiPriority w:val="11"/>
     <w:qFormat/>
+    <w:rsid w:val="004F69D2"/>
     <w:pPr>
       <w:spacing w:before="60" w:after="120"/>
-      <w:jc w:val="center"/>
+      <w:ind w:firstLine="0"/>
+      <w:jc w:val="left"/>
     </w:pPr>
     <w:rPr>
       <w:sz w:val="36"/>

</xml_diff>

<commit_message>
Résolution d'un bug d'affichage sur le menu Options
Modify taskGestionLcd to only process queueAffichage messages when currentScreen == HOME, preventing LCD updates from occurring while other screens are active. Also includes an updated binary Rapport communication.docx.
</commit_message>
<xml_diff>
--- a/IHM_Hub/Rapport communication.docx
+++ b/IHM_Hub/Rapport communication.docx
@@ -274,10 +274,85 @@
         <w:t>Tests</w:t>
       </w:r>
     </w:p>
-    <w:p/>
     <w:p>
       <w:r>
         <w:t>Lors de l’envoi d’une trame par le clavier, le hub traite correctement la trame et renvoi une trame en réponse.</w:t>
+      </w:r>
+    </w:p>
+    <w:p>
+      <w:pPr>
+        <w:ind w:firstLine="0"/>
+      </w:pPr>
+      <w:r>
+        <w:drawing>
+          <wp:inline distT="0" distB="0" distL="0" distR="0" wp14:anchorId="130FA9C7" wp14:editId="2C0D8552">
+            <wp:extent cx="6120130" cy="2830195"/>
+            <wp:effectExtent l="0" t="0" r="0" b="8255"/>
+            <wp:docPr id="780108702" name="Image 1"/>
+            <wp:cNvGraphicFramePr>
+              <a:graphicFrameLocks xmlns:a="http://schemas.openxmlformats.org/drawingml/2006/main" noChangeAspect="1"/>
+            </wp:cNvGraphicFramePr>
+            <a:graphic xmlns:a="http://schemas.openxmlformats.org/drawingml/2006/main">
+              <a:graphicData uri="http://schemas.openxmlformats.org/drawingml/2006/picture">
+                <pic:pic xmlns:pic="http://schemas.openxmlformats.org/drawingml/2006/picture">
+                  <pic:nvPicPr>
+                    <pic:cNvPr id="780108702" name=""/>
+                    <pic:cNvPicPr/>
+                  </pic:nvPicPr>
+                  <pic:blipFill>
+                    <a:blip r:embed="rId7"/>
+                    <a:stretch>
+                      <a:fillRect/>
+                    </a:stretch>
+                  </pic:blipFill>
+                  <pic:spPr>
+                    <a:xfrm>
+                      <a:off x="0" y="0"/>
+                      <a:ext cx="6120130" cy="2830195"/>
+                    </a:xfrm>
+                    <a:prstGeom prst="rect">
+                      <a:avLst/>
+                    </a:prstGeom>
+                  </pic:spPr>
+                </pic:pic>
+              </a:graphicData>
+            </a:graphic>
+          </wp:inline>
+        </w:drawing>
+      </w:r>
+    </w:p>
+    <w:p>
+      <w:pPr>
+        <w:ind w:firstLine="0"/>
+        <w:rPr>
+          <w:i/>
+          <w:iCs/>
+          <w:sz w:val="22"/>
+          <w:szCs w:val="22"/>
+        </w:rPr>
+      </w:pPr>
+      <w:r>
+        <w:rPr>
+          <w:i/>
+          <w:iCs/>
+          <w:sz w:val="22"/>
+          <w:szCs w:val="22"/>
+        </w:rPr>
+        <w:t>Retour communication série côté HUB</w:t>
+      </w:r>
+    </w:p>
+    <w:p>
+      <w:pPr>
+        <w:ind w:firstLine="0"/>
+      </w:pPr>
+      <w:r>
+        <w:t>On peut voir que le HUB reçoit bien la trame du clavier (écrivant « Demande longueur MDP » en conséquence) et lui renvoi donc la longueur du MDP enregistrée (4)</w:t>
+      </w:r>
+      <w:r>
+        <w:t>.</w:t>
+      </w:r>
+      <w:r>
+        <w:t xml:space="preserve"> La communication est donc effective !</w:t>
       </w:r>
     </w:p>
     <w:sectPr>
@@ -995,7 +1070,6 @@
   <w:style w:type="character" w:default="1" w:styleId="Policepardfaut">
     <w:name w:val="Default Paragraph Font"/>
     <w:uiPriority w:val="1"/>
-    <w:semiHidden/>
     <w:unhideWhenUsed/>
   </w:style>
   <w:style w:type="table" w:default="1" w:styleId="TableauNormal">
@@ -1054,6 +1128,18 @@
     <w:rPr>
       <w:sz w:val="36"/>
       <w:szCs w:val="36"/>
+    </w:rPr>
+  </w:style>
+  <w:style w:type="character" w:styleId="Accentuationlgre">
+    <w:name w:val="Subtle Emphasis"/>
+    <w:uiPriority w:val="19"/>
+    <w:qFormat/>
+    <w:rsid w:val="00AD2B7A"/>
+    <w:rPr>
+      <w:i/>
+      <w:iCs/>
+      <w:sz w:val="22"/>
+      <w:szCs w:val="22"/>
     </w:rPr>
   </w:style>
 </w:styles>

</xml_diff>

<commit_message>
Add ALARM screen and sensor/MDP handling
Introduce an ALARM screen (enum + draw/init functions) and wire it into setScreen. Consolidate and relocate handleMDPInput, send password verification over Serial2 and toggle lock on success. Revise taskTraiteSensor to debounce motion notifications (isAlreadyDetected), only render the motion icon when not in ALARM, clear the icon correctly, and trigger the ALARM screen when the hub is locked and motion is detected. Minor logging/text changes. Also updated IHM and report files (binary document changes).
</commit_message>
<xml_diff>
--- a/IHM_Hub/Rapport communication.docx
+++ b/IHM_Hub/Rapport communication.docx
@@ -284,6 +284,9 @@
         <w:ind w:firstLine="0"/>
       </w:pPr>
       <w:r>
+        <w:rPr>
+          <w:noProof/>
+        </w:rPr>
         <w:drawing>
           <wp:inline distT="0" distB="0" distL="0" distR="0" wp14:anchorId="130FA9C7" wp14:editId="2C0D8552">
             <wp:extent cx="6120130" cy="2830195"/>
@@ -355,6 +358,164 @@
         <w:t xml:space="preserve"> La communication est donc effective !</w:t>
       </w:r>
     </w:p>
+    <w:p>
+      <w:pPr>
+        <w:pStyle w:val="Titre"/>
+      </w:pPr>
+      <w:r>
+        <w:lastRenderedPageBreak/>
+        <w:t>Gestion de l’alarme sur le HUB</w:t>
+      </w:r>
+    </w:p>
+    <w:p>
+      <w:pPr>
+        <w:pStyle w:val="Sous-titre"/>
+      </w:pPr>
+      <w:r>
+        <w:t>Objectif</w:t>
+      </w:r>
+    </w:p>
+    <w:p>
+      <w:r>
+        <w:t>L’objectif pour le HUB est d’activer l’alarme sonore quand une intrusion est détectée. Cette activation doit se faire uniquement lorsque le mode alarme est délibérément activée par l’utilisateur.</w:t>
+      </w:r>
+    </w:p>
+    <w:p>
+      <w:pPr>
+        <w:pStyle w:val="Sous-titre"/>
+      </w:pPr>
+      <w:r>
+        <w:t>Mode alarme</w:t>
+      </w:r>
+    </w:p>
+    <w:p>
+      <w:r>
+        <w:t>Pour activer le mode alarme, l’utilisateur à deux options. Activer l’alarme à l’aide du bouton alarme sur l’écran du HUB ou bien rentrer le mot de passe alors que le mode alarme est activé.</w:t>
+      </w:r>
+    </w:p>
+    <w:p>
+      <w:pPr>
+        <w:ind w:firstLine="0"/>
+      </w:pPr>
+      <w:r>
+        <w:drawing>
+          <wp:inline distT="0" distB="0" distL="0" distR="0" wp14:anchorId="75EAD068" wp14:editId="7492F16D">
+            <wp:extent cx="6120130" cy="2126615"/>
+            <wp:effectExtent l="0" t="0" r="0" b="6985"/>
+            <wp:docPr id="1491139395" name="Image 1"/>
+            <wp:cNvGraphicFramePr>
+              <a:graphicFrameLocks xmlns:a="http://schemas.openxmlformats.org/drawingml/2006/main" noChangeAspect="1"/>
+            </wp:cNvGraphicFramePr>
+            <a:graphic xmlns:a="http://schemas.openxmlformats.org/drawingml/2006/main">
+              <a:graphicData uri="http://schemas.openxmlformats.org/drawingml/2006/picture">
+                <pic:pic xmlns:pic="http://schemas.openxmlformats.org/drawingml/2006/picture">
+                  <pic:nvPicPr>
+                    <pic:cNvPr id="1491139395" name=""/>
+                    <pic:cNvPicPr/>
+                  </pic:nvPicPr>
+                  <pic:blipFill>
+                    <a:blip r:embed="rId8"/>
+                    <a:stretch>
+                      <a:fillRect/>
+                    </a:stretch>
+                  </pic:blipFill>
+                  <pic:spPr>
+                    <a:xfrm>
+                      <a:off x="0" y="0"/>
+                      <a:ext cx="6120130" cy="2126615"/>
+                    </a:xfrm>
+                    <a:prstGeom prst="rect">
+                      <a:avLst/>
+                    </a:prstGeom>
+                  </pic:spPr>
+                </pic:pic>
+              </a:graphicData>
+            </a:graphic>
+          </wp:inline>
+        </w:drawing>
+      </w:r>
+    </w:p>
+    <w:p>
+      <w:r>
+        <w:t xml:space="preserve">Une fois activée, lorsqu’un mouvement est </w:t>
+      </w:r>
+      <w:r>
+        <w:t>détecté</w:t>
+      </w:r>
+      <w:r>
+        <w:t xml:space="preserve"> par un capteur, </w:t>
+      </w:r>
+      <w:r>
+        <w:t>l’alarme sonore se déclenche et le HUB entre en mode INTRUSION. Il est alors impossible de de désactiver ce mode autrement qu’en entrant le code sur le clavier.</w:t>
+      </w:r>
+    </w:p>
+    <w:p>
+      <w:pPr>
+        <w:ind w:firstLine="0"/>
+      </w:pPr>
+      <w:r>
+        <w:drawing>
+          <wp:inline distT="0" distB="0" distL="0" distR="0" wp14:anchorId="345BFD9A" wp14:editId="31FA8BC9">
+            <wp:extent cx="6120130" cy="2223770"/>
+            <wp:effectExtent l="0" t="0" r="0" b="5080"/>
+            <wp:docPr id="1629449000" name="Image 1"/>
+            <wp:cNvGraphicFramePr>
+              <a:graphicFrameLocks xmlns:a="http://schemas.openxmlformats.org/drawingml/2006/main" noChangeAspect="1"/>
+            </wp:cNvGraphicFramePr>
+            <a:graphic xmlns:a="http://schemas.openxmlformats.org/drawingml/2006/main">
+              <a:graphicData uri="http://schemas.openxmlformats.org/drawingml/2006/picture">
+                <pic:pic xmlns:pic="http://schemas.openxmlformats.org/drawingml/2006/picture">
+                  <pic:nvPicPr>
+                    <pic:cNvPr id="1629449000" name=""/>
+                    <pic:cNvPicPr/>
+                  </pic:nvPicPr>
+                  <pic:blipFill>
+                    <a:blip r:embed="rId9"/>
+                    <a:stretch>
+                      <a:fillRect/>
+                    </a:stretch>
+                  </pic:blipFill>
+                  <pic:spPr>
+                    <a:xfrm>
+                      <a:off x="0" y="0"/>
+                      <a:ext cx="6120130" cy="2223770"/>
+                    </a:xfrm>
+                    <a:prstGeom prst="rect">
+                      <a:avLst/>
+                    </a:prstGeom>
+                  </pic:spPr>
+                </pic:pic>
+              </a:graphicData>
+            </a:graphic>
+          </wp:inline>
+        </w:drawing>
+      </w:r>
+    </w:p>
+    <w:p>
+      <w:pPr>
+        <w:ind w:firstLine="0"/>
+      </w:pPr>
+    </w:p>
+    <w:p>
+      <w:pPr>
+        <w:ind w:firstLine="0"/>
+      </w:pPr>
+    </w:p>
+    <w:p>
+      <w:pPr>
+        <w:ind w:firstLine="0"/>
+      </w:pPr>
+    </w:p>
+    <w:p>
+      <w:pPr>
+        <w:pStyle w:val="Sous-titre"/>
+      </w:pPr>
+      <w:r>
+        <w:lastRenderedPageBreak/>
+        <w:t>Tests</w:t>
+      </w:r>
+    </w:p>
+    <w:p/>
     <w:sectPr>
       <w:pgSz w:w="11906" w:h="16838"/>
       <w:pgMar w:top="1134" w:right="1134" w:bottom="1134" w:left="1134" w:header="0" w:footer="0" w:gutter="0"/>
@@ -1070,6 +1231,7 @@
   <w:style w:type="character" w:default="1" w:styleId="Policepardfaut">
     <w:name w:val="Default Paragraph Font"/>
     <w:uiPriority w:val="1"/>
+    <w:semiHidden/>
     <w:unhideWhenUsed/>
   </w:style>
   <w:style w:type="table" w:default="1" w:styleId="TableauNormal">

</xml_diff>

<commit_message>
Ajout alarme LED + un peu avancé le rapport
Add FastLED dependency and control the M5GO Bottom2 LED bar. platformio.ini: add fastled/FastLED@3.6.0. main.cpp: include <FastLED.h>, define LED_PIN/NUM_LEDS and CRGB leds[], initialize LEDs in setup (addLeds, setBrightness, clear).

Implement visual alarm behavior: use orange ambient color when armed, clear LEDs when alarm is off, light LEDs orange when armed, and blink LEDs red during ALARM via new BlinkLeds(). Update button label behavior to show PANIC when already locked and press toggles to ALARM. Minor UI fixes: consolidate text drawing for "Alarme Desactivee", adjust text datum and colors.

Persist state across restarts: rename preference key to "locked_state" and add saving/restoring of current screen (saved_screen). Misc: small comment and buffer fixes, removed fragmented multi-color title drawing, and added a temporary LibreOffice lock file and updated binary ODG/DOCX assets.
</commit_message>
<xml_diff>
--- a/IHM_Hub/Rapport communication.docx
+++ b/IHM_Hub/Rapport communication.docx
@@ -61,41 +61,19 @@
         <w:rPr>
           <w:color w:val="117A02" w:themeColor="accent1" w:themeShade="BF"/>
         </w:rPr>
-        <w:t>‘</w:t>
-      </w:r>
-      <w:proofErr w:type="spellStart"/>
+        <w:t>‘s</w:t>
+      </w:r>
       <w:r>
         <w:rPr>
           <w:color w:val="117A02" w:themeColor="accent1" w:themeShade="BF"/>
         </w:rPr>
-        <w:t>s</w:t>
+        <w:t>tr</w:t>
       </w:r>
       <w:r>
         <w:rPr>
           <w:color w:val="117A02" w:themeColor="accent1" w:themeShade="BF"/>
         </w:rPr>
-        <w:t>tr</w:t>
-      </w:r>
-      <w:proofErr w:type="spellEnd"/>
-      <w:r>
-        <w:rPr>
-          <w:color w:val="117A02" w:themeColor="accent1" w:themeShade="BF"/>
-        </w:rPr>
-        <w:t>’/Source/Destination/</w:t>
-      </w:r>
-      <w:proofErr w:type="spellStart"/>
-      <w:r>
-        <w:rPr>
-          <w:color w:val="117A02" w:themeColor="accent1" w:themeShade="BF"/>
-        </w:rPr>
-        <w:t>TypeInformation</w:t>
-      </w:r>
-      <w:proofErr w:type="spellEnd"/>
-      <w:r>
-        <w:rPr>
-          <w:color w:val="117A02" w:themeColor="accent1" w:themeShade="BF"/>
-        </w:rPr>
-        <w:t>/Valeur/n</w:t>
+        <w:t>’/Source/Destination/TypeInformation/Valeur/n</w:t>
       </w:r>
       <w:r>
         <w:rPr>
@@ -398,6 +376,9 @@
         <w:ind w:firstLine="0"/>
       </w:pPr>
       <w:r>
+        <w:rPr>
+          <w:noProof/>
+        </w:rPr>
         <w:drawing>
           <wp:inline distT="0" distB="0" distL="0" distR="0" wp14:anchorId="75EAD068" wp14:editId="7492F16D">
             <wp:extent cx="6120130" cy="2126615"/>
@@ -454,6 +435,9 @@
         <w:ind w:firstLine="0"/>
       </w:pPr>
       <w:r>
+        <w:rPr>
+          <w:noProof/>
+        </w:rPr>
         <w:drawing>
           <wp:inline distT="0" distB="0" distL="0" distR="0" wp14:anchorId="345BFD9A" wp14:editId="31FA8BC9">
             <wp:extent cx="6120130" cy="2223770"/>
@@ -512,6 +496,38 @@
       </w:pPr>
       <w:r>
         <w:lastRenderedPageBreak/>
+        <w:t>Choix technique</w:t>
+      </w:r>
+    </w:p>
+    <w:p>
+      <w:pPr>
+        <w:pStyle w:val="Corpsdetexte"/>
+      </w:pPr>
+      <w:r>
+        <w:t>L'enjeu a été de fournir une interface à la fois simple d'utilisation et surtout claire afin de pouvoir consulter rapidement l'état actuel de l'alarme. Deux modes principaux ont été ajoutés, le mode désactivé et activé.</w:t>
+      </w:r>
+    </w:p>
+    <w:p>
+      <w:pPr>
+        <w:pStyle w:val="Corpsdetexte"/>
+      </w:pPr>
+      <w:r>
+        <w:t>Un mode partiel permettant de surveiller uniquement les intrusions sans prendre en compte les capteurs internes, pour la nuit notamment, aurait été un plus mais n'a pas pu être intégré faute de temps.</w:t>
+      </w:r>
+    </w:p>
+    <w:p>
+      <w:pPr>
+        <w:pStyle w:val="Corpsdetexte"/>
+      </w:pPr>
+      <w:r>
+        <w:t>La programmation horaire aurait également été un plus.</w:t>
+      </w:r>
+    </w:p>
+    <w:p>
+      <w:pPr>
+        <w:pStyle w:val="Sous-titre"/>
+      </w:pPr>
+      <w:r>
         <w:t>Tests</w:t>
       </w:r>
     </w:p>

</xml_diff>

<commit_message>
Add LCD notifications, extend RFID regex, fix logic
Send LCD queue messages for RFID badge, keyboard password change, and RFID add events; extend RFID/Add/Del regex length limits from 17 to 25 chars to accept longer tags. Add logSerial(buffer) to trace incoming frames and update pairing log text to "pas en mode appairage". Refactor AddRFID branch to return distinct serial responses for already-present and invalid-format cases and push an "RFID Added" LCD message on success. Add early returns in RFID list navigation handlers and include a commented preference reset. Misc. formatting/brace cleanup.
</commit_message>
<xml_diff>
--- a/IHM_Hub/Rapport communication.docx
+++ b/IHM_Hub/Rapport communication.docx
@@ -61,19 +61,41 @@
         <w:rPr>
           <w:color w:val="117A02" w:themeColor="accent1" w:themeShade="BF"/>
         </w:rPr>
-        <w:t>‘s</w:t>
-      </w:r>
+        <w:t>‘</w:t>
+      </w:r>
+      <w:proofErr w:type="spellStart"/>
       <w:r>
         <w:rPr>
           <w:color w:val="117A02" w:themeColor="accent1" w:themeShade="BF"/>
         </w:rPr>
+        <w:t>s</w:t>
+      </w:r>
+      <w:r>
+        <w:rPr>
+          <w:color w:val="117A02" w:themeColor="accent1" w:themeShade="BF"/>
+        </w:rPr>
         <w:t>tr</w:t>
       </w:r>
+      <w:proofErr w:type="spellEnd"/>
       <w:r>
         <w:rPr>
           <w:color w:val="117A02" w:themeColor="accent1" w:themeShade="BF"/>
         </w:rPr>
-        <w:t>’/Source/Destination/TypeInformation/Valeur/n</w:t>
+        <w:t>’/Source/Destination/</w:t>
+      </w:r>
+      <w:proofErr w:type="spellStart"/>
+      <w:r>
+        <w:rPr>
+          <w:color w:val="117A02" w:themeColor="accent1" w:themeShade="BF"/>
+        </w:rPr>
+        <w:t>TypeInformation</w:t>
+      </w:r>
+      <w:proofErr w:type="spellEnd"/>
+      <w:r>
+        <w:rPr>
+          <w:color w:val="117A02" w:themeColor="accent1" w:themeShade="BF"/>
+        </w:rPr>
+        <w:t>/Valeur/n</w:t>
       </w:r>
       <w:r>
         <w:rPr>
@@ -380,9 +402,9 @@
           <w:noProof/>
         </w:rPr>
         <w:drawing>
-          <wp:inline distT="0" distB="0" distL="0" distR="0" wp14:anchorId="75EAD068" wp14:editId="7492F16D">
-            <wp:extent cx="6120130" cy="2126615"/>
-            <wp:effectExtent l="0" t="0" r="0" b="6985"/>
+          <wp:inline distT="0" distB="0" distL="0" distR="0" wp14:anchorId="75EAD068" wp14:editId="02F77F86">
+            <wp:extent cx="6120130" cy="2098330"/>
+            <wp:effectExtent l="0" t="0" r="0" b="0"/>
             <wp:docPr id="1491139395" name="Image 1"/>
             <wp:cNvGraphicFramePr>
               <a:graphicFrameLocks xmlns:a="http://schemas.openxmlformats.org/drawingml/2006/main" noChangeAspect="1"/>
@@ -391,11 +413,17 @@
               <a:graphicData uri="http://schemas.openxmlformats.org/drawingml/2006/picture">
                 <pic:pic xmlns:pic="http://schemas.openxmlformats.org/drawingml/2006/picture">
                   <pic:nvPicPr>
-                    <pic:cNvPr id="1491139395" name=""/>
+                    <pic:cNvPr id="1491139395" name="Image 1"/>
                     <pic:cNvPicPr/>
                   </pic:nvPicPr>
                   <pic:blipFill>
-                    <a:blip r:embed="rId8"/>
+                    <a:blip r:embed="rId8">
+                      <a:extLst>
+                        <a:ext uri="{28A0092B-C50C-407E-A947-70E740481C1C}">
+                          <a14:useLocalDpi xmlns:a14="http://schemas.microsoft.com/office/drawing/2010/main" val="0"/>
+                        </a:ext>
+                      </a:extLst>
+                    </a:blip>
                     <a:stretch>
                       <a:fillRect/>
                     </a:stretch>
@@ -403,7 +431,7 @@
                   <pic:spPr>
                     <a:xfrm>
                       <a:off x="0" y="0"/>
-                      <a:ext cx="6120130" cy="2126615"/>
+                      <a:ext cx="6120130" cy="2098330"/>
                     </a:xfrm>
                     <a:prstGeom prst="rect">
                       <a:avLst/>
@@ -439,9 +467,9 @@
           <w:noProof/>
         </w:rPr>
         <w:drawing>
-          <wp:inline distT="0" distB="0" distL="0" distR="0" wp14:anchorId="345BFD9A" wp14:editId="31FA8BC9">
-            <wp:extent cx="6120130" cy="2223770"/>
-            <wp:effectExtent l="0" t="0" r="0" b="5080"/>
+          <wp:inline distT="0" distB="0" distL="0" distR="0" wp14:anchorId="345BFD9A" wp14:editId="3870A91C">
+            <wp:extent cx="6120130" cy="2112702"/>
+            <wp:effectExtent l="0" t="0" r="0" b="1905"/>
             <wp:docPr id="1629449000" name="Image 1"/>
             <wp:cNvGraphicFramePr>
               <a:graphicFrameLocks xmlns:a="http://schemas.openxmlformats.org/drawingml/2006/main" noChangeAspect="1"/>
@@ -450,11 +478,17 @@
               <a:graphicData uri="http://schemas.openxmlformats.org/drawingml/2006/picture">
                 <pic:pic xmlns:pic="http://schemas.openxmlformats.org/drawingml/2006/picture">
                   <pic:nvPicPr>
-                    <pic:cNvPr id="1629449000" name=""/>
+                    <pic:cNvPr id="1629449000" name="Image 1"/>
                     <pic:cNvPicPr/>
                   </pic:nvPicPr>
                   <pic:blipFill>
-                    <a:blip r:embed="rId9"/>
+                    <a:blip r:embed="rId9">
+                      <a:extLst>
+                        <a:ext uri="{28A0092B-C50C-407E-A947-70E740481C1C}">
+                          <a14:useLocalDpi xmlns:a14="http://schemas.microsoft.com/office/drawing/2010/main" val="0"/>
+                        </a:ext>
+                      </a:extLst>
+                    </a:blip>
                     <a:stretch>
                       <a:fillRect/>
                     </a:stretch>
@@ -462,7 +496,7 @@
                   <pic:spPr>
                     <a:xfrm>
                       <a:off x="0" y="0"/>
-                      <a:ext cx="6120130" cy="2223770"/>
+                      <a:ext cx="6120130" cy="2112702"/>
                     </a:xfrm>
                     <a:prstGeom prst="rect">
                       <a:avLst/>
@@ -495,8 +529,16 @@
         <w:pStyle w:val="Sous-titre"/>
       </w:pPr>
       <w:r>
+        <w:t>Choix technique</w:t>
+      </w:r>
+    </w:p>
+    <w:p>
+      <w:pPr>
+        <w:pStyle w:val="Corpsdetexte"/>
+      </w:pPr>
+      <w:r>
         <w:lastRenderedPageBreak/>
-        <w:t>Choix technique</w:t>
+        <w:t>L'enjeu a été de fournir une interface à la fois simple d'utilisation et surtout claire afin de pouvoir consulter rapidement l'état actuel de l'alarme. Deux modes principaux ont été ajoutés, le mode désactivé et activé.</w:t>
       </w:r>
     </w:p>
     <w:p>
@@ -504,23 +546,7 @@
         <w:pStyle w:val="Corpsdetexte"/>
       </w:pPr>
       <w:r>
-        <w:t>L'enjeu a été de fournir une interface à la fois simple d'utilisation et surtout claire afin de pouvoir consulter rapidement l'état actuel de l'alarme. Deux modes principaux ont été ajoutés, le mode désactivé et activé.</w:t>
-      </w:r>
-    </w:p>
-    <w:p>
-      <w:pPr>
-        <w:pStyle w:val="Corpsdetexte"/>
-      </w:pPr>
-      <w:r>
         <w:t>Un mode partiel permettant de surveiller uniquement les intrusions sans prendre en compte les capteurs internes, pour la nuit notamment, aurait été un plus mais n'a pas pu être intégré faute de temps.</w:t>
-      </w:r>
-    </w:p>
-    <w:p>
-      <w:pPr>
-        <w:pStyle w:val="Corpsdetexte"/>
-      </w:pPr>
-      <w:r>
-        <w:t>La programmation horaire aurait également été un plus.</w:t>
       </w:r>
     </w:p>
     <w:p>

</xml_diff>

<commit_message>
Fix password color logic; add IHM docs
Corrected color assignment for password UI: index 9 now uses C_GREY instead of C_RED in drawChangePwd and handleChangePwdLogic, keeping the visual state consistent with isAdminPwdChange. Also added and updated IHM_Hub assets: added HUB.odg and 'Usage du hub d'alarme.doc', and updated IHM_Hub.odg and Rapport communication.docx (binary document changes).
</commit_message>
<xml_diff>
--- a/IHM_Hub/Rapport communication.docx
+++ b/IHM_Hub/Rapport communication.docx
@@ -526,9 +526,15 @@
     </w:p>
     <w:p>
       <w:pPr>
+        <w:ind w:firstLine="0"/>
+      </w:pPr>
+    </w:p>
+    <w:p>
+      <w:pPr>
         <w:pStyle w:val="Sous-titre"/>
       </w:pPr>
       <w:r>
+        <w:lastRenderedPageBreak/>
         <w:t>Choix technique</w:t>
       </w:r>
     </w:p>
@@ -537,8 +543,19 @@
         <w:pStyle w:val="Corpsdetexte"/>
       </w:pPr>
       <w:r>
-        <w:lastRenderedPageBreak/>
-        <w:t>L'enjeu a été de fournir une interface à la fois simple d'utilisation et surtout claire afin de pouvoir consulter rapidement l'état actuel de l'alarme. Deux modes principaux ont été ajoutés, le mode désactivé et activé.</w:t>
+        <w:t xml:space="preserve">L'enjeu a été de fournir une interface à la fois simple d'utilisation et surtout claire afin de pouvoir consulter rapidement l'état actuel de l'alarme. Deux modes principaux ont été ajoutés, le mode </w:t>
+      </w:r>
+      <w:r>
+        <w:t xml:space="preserve">alarme </w:t>
+      </w:r>
+      <w:r>
+        <w:t xml:space="preserve">désactivé et </w:t>
+      </w:r>
+      <w:r>
+        <w:t xml:space="preserve">le mode alarme </w:t>
+      </w:r>
+      <w:r>
+        <w:t>activé.</w:t>
       </w:r>
     </w:p>
     <w:p>

</xml_diff>